<commit_message>
Replace report screenshots with authenticated captures
</commit_message>
<xml_diff>
--- a/poc-deliverables/Naveen-Code-Quality-Security-Scanning-POC-Report.docx
+++ b/poc-deliverables/Naveen-Code-Quality-Security-Scanning-POC-Report.docx
@@ -107,14 +107,14 @@
         <w:rPr>
           <w:sz w:val="20"/>
         </w:rPr>
-        <w:t xml:space="preserve">The SME-provided dashboard screenshot shows five open CodeQL findings and healthy tool status. The figure below recreates the verified dashboard evidence because the original image attachment is not available as a workspace file.</w:t>
+        <w:t xml:space="preserve">The authenticated GitHub Code Scanning dashboard shows five open CodeQL findings and healthy tool status.</w:t>
       </w:r>
     </w:p>
     <w:p>
       <w:r>
         <w:drawing>
           <wp:inline distT="0" distB="0" distL="0" distR="0">
-            <wp:extent cx="5669280" cy="3188970"/>
+            <wp:extent cx="5669280" cy="11076242"/>
             <wp:docPr id="1" name="Code Scanning Findings"/>
             <a:graphic>
               <a:graphicData uri="http://schemas.openxmlformats.org/drawingml/2006/picture">
@@ -132,7 +132,7 @@
                   <pic:spPr>
                     <a:xfrm>
                       <a:off x="0" y="0"/>
-                      <a:ext cx="5669280" cy="3188970"/>
+                      <a:ext cx="5669280" cy="11076242"/>
                     </a:xfrm>
                     <a:prstGeom prst="rect">
                       <a:avLst/>
@@ -174,7 +174,7 @@
       <w:r>
         <w:drawing>
           <wp:inline distT="0" distB="0" distL="0" distR="0">
-            <wp:extent cx="5669280" cy="7141473"/>
+            <wp:extent cx="5669280" cy="6954103"/>
             <wp:docPr id="2" name="Pull Request Checks"/>
             <a:graphic>
               <a:graphicData uri="http://schemas.openxmlformats.org/drawingml/2006/picture">
@@ -192,7 +192,7 @@
                   <pic:spPr>
                     <a:xfrm>
                       <a:off x="0" y="0"/>
-                      <a:ext cx="5669280" cy="7141473"/>
+                      <a:ext cx="5669280" cy="6954103"/>
                     </a:xfrm>
                     <a:prstGeom prst="rect">
                       <a:avLst/>
@@ -226,7 +226,7 @@
       <w:r>
         <w:drawing>
           <wp:inline distT="0" distB="0" distL="0" distR="0">
-            <wp:extent cx="5669280" cy="8458416"/>
+            <wp:extent cx="5669280" cy="7880246"/>
             <wp:docPr id="3" name="CodeQL Workflow Success"/>
             <a:graphic>
               <a:graphicData uri="http://schemas.openxmlformats.org/drawingml/2006/picture">
@@ -244,7 +244,7 @@
                   <pic:spPr>
                     <a:xfrm>
                       <a:off x="0" y="0"/>
-                      <a:ext cx="5669280" cy="8458416"/>
+                      <a:ext cx="5669280" cy="7880246"/>
                     </a:xfrm>
                     <a:prstGeom prst="rect">
                       <a:avLst/>

</xml_diff>